<commit_message>
docs(study-guide): expand enterprise master architectural reference
Provide an extended DOCX generation script and update the master study
guide with comprehensive architectural chapters, expanded leadership
standards, and detailed framework engineering references.
</commit_message>
<xml_diff>
--- a/AI_Enterprise_QA_Master_Study_Guide.docx
+++ b/AI_Enterprise_QA_Master_Study_Guide.docx
@@ -4,7 +4,7 @@
   <w:body>
     <w:p>
       <w:pPr>
-        <w:spacing w:after="120"/>
+        <w:spacing w:after="80"/>
         <w:jc w:val="center"/>
       </w:pPr>
       <w:r>
@@ -12,14 +12,14 @@
           <w:rFonts w:ascii="Arial" w:hAnsi="Arial"/>
           <w:b/>
           <w:color w:val="1B365D"/>
-          <w:sz w:val="48"/>
+          <w:sz w:val="44"/>
         </w:rPr>
         <w:t>AI-Enhanced Enterprise Quality Engineering &amp; Governance</w:t>
       </w:r>
     </w:p>
     <w:p>
       <w:pPr>
-        <w:spacing w:after="480"/>
+        <w:spacing w:after="360"/>
         <w:jc w:val="center"/>
       </w:pPr>
       <w:r>
@@ -27,11 +27,11 @@
           <w:rFonts w:ascii="Arial" w:hAnsi="Arial"/>
           <w:i/>
           <w:color w:val="5C768D"/>
-          <w:sz w:val="28"/>
+          <w:sz w:val="26"/>
         </w:rPr>
-        <w:t>Comprehensive Master Study Guide for Senior QA Engineering Managers</w:t>
+        <w:t>Comprehensive Master Study Guide &amp; Architectural Reference Manual</w:t>
         <w:br/>
-        <w:t>(Aligned with Verizon, Trimble, Palo Alto Networks, and CIBC Leadership Standards)</w:t>
+        <w:t>Prepared for Senior QA Engineering Managers (Verizon, Trimble, Palo Alto Networks, CIBC)</w:t>
       </w:r>
     </w:p>
     <w:tbl>
@@ -66,7 +66,7 @@
                 <w:color w:val="1B365D"/>
                 <w:sz w:val="20"/>
               </w:rPr>
-              <w:t>📌 EXECUTIVE SUMMARY</w:t>
+              <w:t>📌 EXECUTIVE COMPREHENSIVE STUDY GUIDE</w:t>
               <w:br/>
             </w:r>
             <w:r>
@@ -76,7 +76,7 @@
                 <w:color w:val="333333"/>
                 <w:sz w:val="21"/>
               </w:rPr>
-              <w:t>This master study guide bridges hands-on multi-language test automation (Java, Python, TypeScript), scalable web/API frameworks (Selenium, Playwright, REST Assured), DevOps quality gates, and advanced AI governance frameworks (LLM-as-a-Judge, Trust Architecture, Shift-Right). Designed for senior engineering leaders.</w:t>
+              <w:t>This master manual provides exhaustive technical depth across multi-language automation (Python, Java, TypeScript), advanced framework engineering (Selenium, Playwright, REST Assured), DevOps pipeline governance, and cutting-edge AI architectures (Trust Architecture, LLM-as-a-Judge, and Shift-Right telemetry). Designed to serve as an authoritative reference for enterprise engineering leaders.</w:t>
             </w:r>
           </w:p>
         </w:tc>
@@ -89,16 +89,16 @@
     </w:p>
     <w:p>
       <w:pPr>
-        <w:spacing w:before="360" w:after="120"/>
+        <w:spacing w:before="320" w:after="120"/>
       </w:pPr>
       <w:r>
         <w:rPr>
           <w:rFonts w:ascii="Arial" w:hAnsi="Arial"/>
           <w:b/>
           <w:color w:val="1B365D"/>
-          <w:sz w:val="36"/>
+          <w:sz w:val="32"/>
         </w:rPr>
-        <w:t>1. Executive Overview &amp; Industry Context</w:t>
+        <w:t>Chapter 1: The Evolution of Quality Engineering &amp; The AI Paradox</w:t>
       </w:r>
     </w:p>
     <w:p>
@@ -111,7 +111,21 @@
           <w:color w:val="333333"/>
           <w:sz w:val="22"/>
         </w:rPr>
-        <w:t>Modern enterprise quality engineering has evolved far beyond traditional functional scripting. As organizations scale microservices, mobile apps, and cloud infrastructure, leaders face the 'AI Paradox in QA'—where high AI adoption and massive test case generation coexist with rising software defect rates due to a lack of governance and contextual test validation.</w:t>
+        <w:t>Modern software delivery operates at unprecedented velocity. Microservices, event-driven architectures, and continuous deployment have made manual quality assurance obsolete. Enterprise organizations like Verizon, CIBC, and Palo Alto Networks demand automated, AI-augmented quality engineering that scales across millions of daily active users and multi-cloud environments.</w:t>
+      </w:r>
+    </w:p>
+    <w:p>
+      <w:pPr>
+        <w:spacing w:before="240" w:after="80"/>
+      </w:pPr>
+      <w:r>
+        <w:rPr>
+          <w:rFonts w:ascii="Arial" w:hAnsi="Arial"/>
+          <w:b/>
+          <w:color w:val="41748D"/>
+          <w:sz w:val="26"/>
+        </w:rPr>
+        <w:t>1.1 The AI Paradox in Quality Assurance</w:t>
       </w:r>
     </w:p>
     <w:p>
@@ -124,7 +138,20 @@
           <w:color w:val="333333"/>
           <w:sz w:val="22"/>
         </w:rPr>
-        <w:t>To succeed in senior roles at telecom, IoT, and cloud giants (such as Verizon and Palo Alto Networks), engineering managers must architect resilient automation pipelines, enforce rigorous CI/CD quality gates, and implement defensible AI Trust Architectures.</w:t>
+        <w:t>A pervasive phenomenon in modern engineering is the 'AI Paradox in QA': organizations experience a massive surge in AI adoption, automatic test case generation, and code coverage metrics, yet simultaneously suffer from rising production defect rates. This occurs because raw test volume does not equal semantic test validity. Foundational models generate hundreds of redundant, surface-level assertions while failing to comprehend nuanced business domain logic, race conditions, or complex multi-tenant data dependencies.</w:t>
+      </w:r>
+    </w:p>
+    <w:p>
+      <w:pPr>
+        <w:spacing w:after="120" w:line="276" w:lineRule="auto"/>
+      </w:pPr>
+      <w:r>
+        <w:rPr>
+          <w:rFonts w:ascii="Calibri" w:hAnsi="Calibri"/>
+          <w:color w:val="333333"/>
+          <w:sz w:val="22"/>
+        </w:rPr>
+        <w:t>To overcome this paradox, senior QA engineering managers must implement rigorous governance frameworks, contextual test validation, semantic deduplication, and automated fault injection (mutation testing).</w:t>
       </w:r>
     </w:p>
     <w:p>
@@ -136,9 +163,9 @@
           <w:rFonts w:ascii="Arial" w:hAnsi="Arial"/>
           <w:b/>
           <w:color w:val="41748D"/>
-          <w:sz w:val="28"/>
+          <w:sz w:val="26"/>
         </w:rPr>
-        <w:t>Core Competency Matrix</w:t>
+        <w:t>1.2 Strategic Pillars of AI-Enhanced QE</w:t>
       </w:r>
     </w:p>
     <w:p>
@@ -153,7 +180,7 @@
           <w:color w:val="2C3E50"/>
           <w:sz w:val="22"/>
         </w:rPr>
-        <w:t xml:space="preserve">Strategy &amp; Vision: </w:t>
+        <w:t xml:space="preserve">Shift-Left &amp; Continuous Validation: </w:t>
       </w:r>
       <w:r>
         <w:rPr>
@@ -161,7 +188,7 @@
           <w:color w:val="333333"/>
           <w:sz w:val="22"/>
         </w:rPr>
-        <w:t>Lead enterprise automation strategy across Web, API, and Mobile ecosystems.</w:t>
+        <w:t>Transitioning from reactive defect detection after release to proactive quality engineering embedded directly into user story creation and architecture design.</w:t>
       </w:r>
     </w:p>
     <w:p>
@@ -176,7 +203,7 @@
           <w:color w:val="2C3E50"/>
           <w:sz w:val="22"/>
         </w:rPr>
-        <w:t xml:space="preserve">Framework Engineering: </w:t>
+        <w:t xml:space="preserve">Autonomous Test Augmentation: </w:t>
       </w:r>
       <w:r>
         <w:rPr>
@@ -184,7 +211,7 @@
           <w:color w:val="333333"/>
           <w:sz w:val="22"/>
         </w:rPr>
-        <w:t>Deploy Playwright (TypeScript/Python) and Selenium with Page Object Model (POM) patterns.</w:t>
+        <w:t>Using AI models to synthesize synthetic user data, predict brittle test paths, and self-heal element locators.</w:t>
       </w:r>
     </w:p>
     <w:p>
@@ -199,7 +226,7 @@
           <w:color w:val="2C3E50"/>
           <w:sz w:val="22"/>
         </w:rPr>
-        <w:t xml:space="preserve">AI Integration: </w:t>
+        <w:t xml:space="preserve">Automated Governance: </w:t>
       </w:r>
       <w:r>
         <w:rPr>
@@ -207,7 +234,7 @@
           <w:color w:val="333333"/>
           <w:sz w:val="22"/>
         </w:rPr>
-        <w:t>Integrate AI/ML tooling for test case scaffolding, data synthesis, and defect prediction.</w:t>
+        <w:t>Enforcing non-negotiable pipeline gates that block artifact promotion if unit, integration, security, or performance thresholds are violated.</w:t>
       </w:r>
     </w:p>
     <w:p>
@@ -222,7 +249,7 @@
           <w:color w:val="2C3E50"/>
           <w:sz w:val="22"/>
         </w:rPr>
-        <w:t xml:space="preserve">Agentic Tooling: </w:t>
+        <w:t xml:space="preserve">Defensible Compliance: </w:t>
       </w:r>
       <w:r>
         <w:rPr>
@@ -230,7 +257,61 @@
           <w:color w:val="333333"/>
           <w:sz w:val="22"/>
         </w:rPr>
-        <w:t>Build MCP servers and LLM agent integrations connecting internal systems (Jira, GitHub, TestRail).</w:t>
+        <w:t>Maintaining strict audit logs, model explainability, and Human-in-the-Loop (HIL) sign-offs for high-risk modules.</w:t>
+      </w:r>
+    </w:p>
+    <w:p>
+      <w:pPr>
+        <w:spacing w:before="320" w:after="120"/>
+      </w:pPr>
+      <w:r>
+        <w:rPr>
+          <w:rFonts w:ascii="Arial" w:hAnsi="Arial"/>
+          <w:b/>
+          <w:color w:val="1B365D"/>
+          <w:sz w:val="32"/>
+        </w:rPr>
+        <w:t>Chapter 2: Phase 1 - AI Test Orchestration, Developer AI Tools &amp; MCP Servers</w:t>
+      </w:r>
+    </w:p>
+    <w:p>
+      <w:pPr>
+        <w:spacing w:after="120" w:line="276" w:lineRule="auto"/>
+      </w:pPr>
+      <w:r>
+        <w:rPr>
+          <w:rFonts w:ascii="Calibri" w:hAnsi="Calibri"/>
+          <w:color w:val="333333"/>
+          <w:sz w:val="22"/>
+        </w:rPr>
+        <w:t>Phase 1 establishes how senior engineering leaders leverage artificial intelligence and developer tooling not just as code-generation novelties, but as integrated systems connected directly to enterprise engineering workflows.</w:t>
+      </w:r>
+    </w:p>
+    <w:p>
+      <w:pPr>
+        <w:spacing w:before="240" w:after="80"/>
+      </w:pPr>
+      <w:r>
+        <w:rPr>
+          <w:rFonts w:ascii="Arial" w:hAnsi="Arial"/>
+          <w:b/>
+          <w:color w:val="41748D"/>
+          <w:sz w:val="26"/>
+        </w:rPr>
+        <w:t>2.1 Developer AI Tools in Enterprise QE</w:t>
+      </w:r>
+    </w:p>
+    <w:p>
+      <w:pPr>
+        <w:spacing w:after="120" w:line="276" w:lineRule="auto"/>
+      </w:pPr>
+      <w:r>
+        <w:rPr>
+          <w:rFonts w:ascii="Calibri" w:hAnsi="Calibri"/>
+          <w:color w:val="333333"/>
+          <w:sz w:val="22"/>
+        </w:rPr>
+        <w:t>Tools like GitHub Copilot, Cursor, and Devin AI transform day-to-day engineering productivity. In a QE context, managers establish guidelines for how engineers utilize these tools:</w:t>
       </w:r>
     </w:p>
     <w:p>
@@ -245,7 +326,7 @@
           <w:color w:val="2C3E50"/>
           <w:sz w:val="22"/>
         </w:rPr>
-        <w:t xml:space="preserve">Governance &amp; DevOps: </w:t>
+        <w:t xml:space="preserve">Test Code Scaffolding: </w:t>
       </w:r>
       <w:r>
         <w:rPr>
@@ -253,21 +334,67 @@
           <w:color w:val="333333"/>
           <w:sz w:val="22"/>
         </w:rPr>
-        <w:t>Enforce pipeline quality gates, performance SLOs (Locust/JMeter), and board-level governance.</w:t>
+        <w:t>Accelerating test scaffolding, boilerplate generation, data-driven test structures, and complex mocking stubs.</w:t>
       </w:r>
     </w:p>
     <w:p>
       <w:pPr>
-        <w:spacing w:before="360" w:after="120"/>
+        <w:pStyle w:val="ListBullet"/>
+        <w:spacing w:after="60" w:line="276" w:lineRule="auto"/>
+      </w:pPr>
+      <w:r>
+        <w:rPr>
+          <w:rFonts w:ascii="Calibri" w:hAnsi="Calibri"/>
+          <w:b/>
+          <w:color w:val="2C3E50"/>
+          <w:sz w:val="22"/>
+        </w:rPr>
+        <w:t xml:space="preserve">Automated Debugging Support: </w:t>
+      </w:r>
+      <w:r>
+        <w:rPr>
+          <w:rFonts w:ascii="Calibri" w:hAnsi="Calibri"/>
+          <w:color w:val="333333"/>
+          <w:sz w:val="22"/>
+        </w:rPr>
+        <w:t>Analyzing stack traces, flaky test failure patterns, and container logs to surface root causes in seconds.</w:t>
+      </w:r>
+    </w:p>
+    <w:p>
+      <w:pPr>
+        <w:pStyle w:val="ListBullet"/>
+        <w:spacing w:after="60" w:line="276" w:lineRule="auto"/>
+      </w:pPr>
+      <w:r>
+        <w:rPr>
+          <w:rFonts w:ascii="Calibri" w:hAnsi="Calibri"/>
+          <w:b/>
+          <w:color w:val="2C3E50"/>
+          <w:sz w:val="22"/>
+        </w:rPr>
+        <w:t xml:space="preserve">TestSuite Optimization: </w:t>
+      </w:r>
+      <w:r>
+        <w:rPr>
+          <w:rFonts w:ascii="Calibri" w:hAnsi="Calibri"/>
+          <w:color w:val="333333"/>
+          <w:sz w:val="22"/>
+        </w:rPr>
+        <w:t>Refactoring legacy automation suites for maintainability, parallel execution readiness, and reduced flakiness.</w:t>
+      </w:r>
+    </w:p>
+    <w:p>
+      <w:pPr>
+        <w:spacing w:before="240" w:after="80"/>
       </w:pPr>
       <w:r>
         <w:rPr>
           <w:rFonts w:ascii="Arial" w:hAnsi="Arial"/>
           <w:b/>
-          <w:color w:val="1B365D"/>
-          <w:sz w:val="36"/>
+          <w:color w:val="41748D"/>
+          <w:sz w:val="26"/>
         </w:rPr>
-        <w:t>2. Phase 1: AI Foundations, Developer AI Tools &amp; Agentic Integrations</w:t>
+        <w:t>2.2 Model Context Protocol (MCP) &amp; LLM Agent Integrations</w:t>
       </w:r>
     </w:p>
     <w:p>
@@ -280,7 +407,7 @@
           <w:color w:val="333333"/>
           <w:sz w:val="22"/>
         </w:rPr>
-        <w:t>Phase 1 establishes the theoretical and practical foundation of AI in QE. Rather than viewing AI as a black box, senior managers learn to orchestrate AI agents for test generation, data synthesis, and system integration.</w:t>
+        <w:t>Enterprise AI automation requires secure, bidirectional communication between Large Language Models and internal systems (Jira, GitHub, TestRail, Snowflake). Model Context Protocol (MCP) and custom agentic orchestration layers allow LLMs to query schemas, fetch requirements, and report test results programmatically.</w:t>
       </w:r>
     </w:p>
     <w:p>
@@ -292,9 +419,9 @@
           <w:rFonts w:ascii="Arial" w:hAnsi="Arial"/>
           <w:b/>
           <w:color w:val="41748D"/>
-          <w:sz w:val="28"/>
+          <w:sz w:val="26"/>
         </w:rPr>
-        <w:t>The AI Paradox &amp; Mitigation Strategies</w:t>
+        <w:t>2.3 Code Implementation: LLM Test Data Generator (Python)</w:t>
       </w:r>
     </w:p>
     <w:p>
@@ -307,34 +434,7 @@
           <w:color w:val="333333"/>
           <w:sz w:val="22"/>
         </w:rPr>
-        <w:t>AI-generated tests often suffer from hallucinations, brittle assertions, and lack of business context. Mitigation requires deterministic quality gates, semantic coverage analysis, and Human-in-the-Loop (HIL) validation.</w:t>
-      </w:r>
-    </w:p>
-    <w:p>
-      <w:pPr>
-        <w:spacing w:before="240" w:after="80"/>
-      </w:pPr>
-      <w:r>
-        <w:rPr>
-          <w:rFonts w:ascii="Arial" w:hAnsi="Arial"/>
-          <w:b/>
-          <w:color w:val="41748D"/>
-          <w:sz w:val="28"/>
-        </w:rPr>
-        <w:t>Hands-on Example: LLM Test Data Generator &amp; Agentic Integration</w:t>
-      </w:r>
-    </w:p>
-    <w:p>
-      <w:pPr>
-        <w:spacing w:after="120" w:line="276" w:lineRule="auto"/>
-      </w:pPr>
-      <w:r>
-        <w:rPr>
-          <w:rFonts w:ascii="Calibri" w:hAnsi="Calibri"/>
-          <w:color w:val="333333"/>
-          <w:sz w:val="22"/>
-        </w:rPr>
-        <w:t>Below is a production-grade Python script demonstrating how an LLM agent generates test data based on natural language requirements and interacts with a mock internal database system.</w:t>
+        <w:t>Below is the production-grade Python script implemented in our training track, illustrating how an AI orchestration layer synthesizes structured test data and simulates interaction with an internal database API.</w:t>
       </w:r>
     </w:p>
     <w:tbl>
@@ -363,7 +463,7 @@
                 <w:color w:val="A0AEC0"/>
                 <w:sz w:val="18"/>
               </w:rPr>
-              <w:t>💻 Python LLM Agent Test Data Generator</w:t>
+              <w:t>💻 llm_test_data_generator.py</w:t>
               <w:br/>
             </w:r>
           </w:p>
@@ -379,26 +479,68 @@
               </w:rPr>
               <w:t>import json</w:t>
               <w:br/>
+              <w:t>import random</w:t>
+              <w:br/>
               <w:br/>
               <w:t>def generate_test_user_data(requirements: str) -&gt; dict:</w:t>
               <w:br/>
-              <w:t xml:space="preserve">    # Simulates LLM generating test data based on natural language</w:t>
+              <w:t xml:space="preserve">    """</w:t>
               <w:br/>
-              <w:t xml:space="preserve">    print(f"LLM Processing Requirements: '{requirements}'")</w:t>
+              <w:t xml:space="preserve">    Simulates an LLM agent generating contextual test data based on natural language requirements.</w:t>
               <w:br/>
-              <w:t xml:space="preserve">    </w:t>
+              <w:t xml:space="preserve">    In enterprise deployments, this interfaces with Azure OpenAI or AWS Bedrock APIs.</w:t>
+              <w:br/>
+              <w:t xml:space="preserve">    """</w:t>
+              <w:br/>
+              <w:t xml:space="preserve">    print(f"[LLM Agent] Processing Natural Language Requirements: '{requirements}'")</w:t>
+              <w:br/>
               <w:br/>
               <w:t xml:space="preserve">    mock_data = {</w:t>
               <w:br/>
-              <w:t xml:space="preserve">        "valid_user": {"firstName": "John", "email": "john.doe@example.com", "age": 30},</w:t>
+              <w:t xml:space="preserve">        "valid_user": {</w:t>
               <w:br/>
-              <w:t xml:space="preserve">        "invalid_email_user": {"firstName": "Jane", "email": "invalid-email", "age": 25},</w:t>
+              <w:t xml:space="preserve">            "firstName": "John",</w:t>
               <w:br/>
-              <w:t xml:space="preserve">        "minor_user": {"firstName": "Alice", "email": "alice@example.com", "age": 16}</w:t>
+              <w:t xml:space="preserve">            "lastName": "Doe",</w:t>
+              <w:br/>
+              <w:t xml:space="preserve">            "email": "john.doe@enterprise.com",</w:t>
+              <w:br/>
+              <w:t xml:space="preserve">            "age": 30,</w:t>
+              <w:br/>
+              <w:t xml:space="preserve">            "isActive": True</w:t>
+              <w:br/>
+              <w:t xml:space="preserve">        },</w:t>
+              <w:br/>
+              <w:t xml:space="preserve">        "invalid_email_user": {</w:t>
+              <w:br/>
+              <w:t xml:space="preserve">            "firstName": "Jane",</w:t>
+              <w:br/>
+              <w:t xml:space="preserve">            "lastName": "Smith",</w:t>
+              <w:br/>
+              <w:t xml:space="preserve">            "email": "invalid-email-format",</w:t>
+              <w:br/>
+              <w:t xml:space="preserve">            "age": 25,</w:t>
+              <w:br/>
+              <w:t xml:space="preserve">            "isActive": True</w:t>
+              <w:br/>
+              <w:t xml:space="preserve">        },</w:t>
+              <w:br/>
+              <w:t xml:space="preserve">        "minor_user": {</w:t>
+              <w:br/>
+              <w:t xml:space="preserve">            "firstName": "Alice",</w:t>
+              <w:br/>
+              <w:t xml:space="preserve">            "lastName": "Wonder",</w:t>
+              <w:br/>
+              <w:t xml:space="preserve">            "email": "alice.wonder@enterprise.com",</w:t>
+              <w:br/>
+              <w:t xml:space="preserve">            "age": 16,</w:t>
+              <w:br/>
+              <w:t xml:space="preserve">            "isActive": False</w:t>
+              <w:br/>
+              <w:t xml:space="preserve">        }</w:t>
               <w:br/>
               <w:t xml:space="preserve">    }</w:t>
               <w:br/>
-              <w:t xml:space="preserve">    </w:t>
               <w:br/>
               <w:t xml:space="preserve">    if "invalid email" in requirements.lower():</w:t>
               <w:br/>
@@ -413,19 +555,48 @@
               <w:t xml:space="preserve">        return mock_data["valid_user"]</w:t>
               <w:br/>
               <w:br/>
-              <w:t>def mock_save_user_to_db(user_data: dict) -&gt; bool:</w:t>
+              <w:t>def mock_save_user_to_internal_system(user_data: dict) -&gt; bool:</w:t>
               <w:br/>
-              <w:t xml:space="preserve">    # Simulates internal system integration (MCP / DB API)</w:t>
+              <w:t xml:space="preserve">    """</w:t>
               <w:br/>
-              <w:t xml:space="preserve">    if "@" in user_data.get("email", ""):</w:t>
+              <w:t xml:space="preserve">    Simulates interaction with internal backend systems (MCP Connector / Database API).</w:t>
               <w:br/>
-              <w:t xml:space="preserve">        print("Internal System: User saved successfully.")</w:t>
+              <w:t xml:space="preserve">    """</w:t>
+              <w:br/>
+              <w:t xml:space="preserve">    email = user_data.get('email', '')</w:t>
+              <w:br/>
+              <w:t xml:space="preserve">    print(f"[Internal System API] Saving user record: {email}")</w:t>
+              <w:br/>
+              <w:t xml:space="preserve">    if email and '@' in email and '.' in email.split('@')[1]:</w:t>
+              <w:br/>
+              <w:t xml:space="preserve">        print("[Internal System API] Success: User record persisted.")</w:t>
               <w:br/>
               <w:t xml:space="preserve">        return True</w:t>
               <w:br/>
-              <w:t xml:space="preserve">    print("Internal System: Validation failed.")</w:t>
+              <w:t xml:space="preserve">    else:</w:t>
+              <w:br/>
+              <w:t xml:space="preserve">        print("[Internal System API] Error: Persistence rejected due to data validation rules.")</w:t>
               <w:br/>
               <w:t xml:space="preserve">        return False</w:t>
+              <w:br/>
+              <w:br/>
+              <w:t>if __name__ == "__main__":</w:t>
+              <w:br/>
+              <w:t xml:space="preserve">    print("=== Enterprise LLM Test Data Generation &amp; Integration Harness ===")</w:t>
+              <w:br/>
+              <w:t xml:space="preserve">    </w:t>
+              <w:br/>
+              <w:t xml:space="preserve">    reqs = ["Standard valid user", "User with invalid email format", "Minor user under 18"]</w:t>
+              <w:br/>
+              <w:t xml:space="preserve">    for req in reqs:</w:t>
+              <w:br/>
+              <w:t xml:space="preserve">        data = generate_test_user_data(req)</w:t>
+              <w:br/>
+              <w:t xml:space="preserve">        print(f"Generated Payload:\n{json.dumps(data, indent=2)}")</w:t>
+              <w:br/>
+              <w:t xml:space="preserve">        mock_save_user_to_internal_system(data)</w:t>
+              <w:br/>
+              <w:t xml:space="preserve">        print("-" * 50)</w:t>
               <w:br/>
             </w:r>
           </w:p>
@@ -439,16 +610,16 @@
     </w:p>
     <w:p>
       <w:pPr>
-        <w:spacing w:before="360" w:after="120"/>
+        <w:spacing w:before="320" w:after="120"/>
       </w:pPr>
       <w:r>
         <w:rPr>
           <w:rFonts w:ascii="Arial" w:hAnsi="Arial"/>
           <w:b/>
           <w:color w:val="1B365D"/>
-          <w:sz w:val="36"/>
+          <w:sz w:val="32"/>
         </w:rPr>
-        <w:t>3. Phase 2: Scalable Web, API &amp; Mobile Test Engineering</w:t>
+        <w:t>Chapter 3: Phase 2 - Scalable Web, API &amp; Mobile Test Engineering Frameworks</w:t>
       </w:r>
     </w:p>
     <w:p>
@@ -461,7 +632,7 @@
           <w:color w:val="333333"/>
           <w:sz w:val="22"/>
         </w:rPr>
-        <w:t>Phase 2 covers robust framework engineering across Java and TypeScript, interacting with real external test applications (Heroku The-Internet and JSONPlaceholder APIs).</w:t>
+        <w:t>Phase 2 bridges multi-language framework engineering, comparing Selenium WebDriver and Playwright across Java and TypeScript, while establishing robust API test suites.</w:t>
       </w:r>
     </w:p>
     <w:p>
@@ -473,9 +644,9 @@
           <w:rFonts w:ascii="Arial" w:hAnsi="Arial"/>
           <w:b/>
           <w:color w:val="41748D"/>
-          <w:sz w:val="28"/>
+          <w:sz w:val="26"/>
         </w:rPr>
-        <w:t>Selenium vs. Playwright Comparison</w:t>
+        <w:t>3.1 Selenium WebDriver vs. Playwright Architectural Analysis</w:t>
       </w:r>
     </w:p>
     <w:p>
@@ -498,7 +669,7 @@
           <w:color w:val="333333"/>
           <w:sz w:val="22"/>
         </w:rPr>
-        <w:t>JSON Wire Protocol / W3C WebDriver. Requires explicit waits and WebDriverManager.</w:t>
+        <w:t>Communicates via JSON Wire Protocol / W3C WebDriver specification over HTTP. Requires browser-specific driver binaries (ChromeDriver, GeckoDriver) and explicit wait strategies.</w:t>
       </w:r>
     </w:p>
     <w:p>
@@ -521,7 +692,7 @@
           <w:color w:val="333333"/>
           <w:sz w:val="22"/>
         </w:rPr>
-        <w:t>Modern WebSocket protocol, automatic waiting, multi-context browser isolation, and native mobile emulation.</w:t>
+        <w:t>Communicates directly over WebSocket protocol with browser binaries. Features auto-waiting on elements before interactions, multi-context browser isolation (ideal for testing multi-user chat or roles), and built-in network interception.</w:t>
       </w:r>
     </w:p>
     <w:p>
@@ -533,9 +704,9 @@
           <w:rFonts w:ascii="Arial" w:hAnsi="Arial"/>
           <w:b/>
           <w:color w:val="41748D"/>
-          <w:sz w:val="28"/>
+          <w:sz w:val="26"/>
         </w:rPr>
-        <w:t>TypeScript Playwright Page Object Model (POM)</w:t>
+        <w:t>3.2 TypeScript Playwright Page Object Model (POM)</w:t>
       </w:r>
     </w:p>
     <w:p>
@@ -548,7 +719,7 @@
           <w:color w:val="333333"/>
           <w:sz w:val="22"/>
         </w:rPr>
-        <w:t>Enterprise test suites mandate clean separation of concerns using POM. Here is the TypeScript implementation used in our training framework:</w:t>
+        <w:t>Our enterprise TypeScript Playwright framework enforces strict separation of concerns, ensuring maintainability across large-scale UI test suites.</w:t>
       </w:r>
     </w:p>
     <w:tbl>
@@ -577,7 +748,7 @@
                 <w:color w:val="A0AEC0"/>
                 <w:sz w:val="18"/>
               </w:rPr>
-              <w:t>💻 TypeScript Playwright Page Object Model (LoginPage.ts)</w:t>
+              <w:t>💻 LoginPage.ts (TypeScript Playwright POM)</w:t>
               <w:br/>
             </w:r>
           </w:p>
@@ -593,6 +764,12 @@
               </w:rPr>
               <w:t>import { Page, Locator } from '@playwright/test';</w:t>
               <w:br/>
+              <w:br/>
+              <w:t>/**</w:t>
+              <w:br/>
+              <w:t xml:space="preserve"> * Page Object Model for Heroku Secure Authentication Feature</w:t>
+              <w:br/>
+              <w:t xml:space="preserve"> */</w:t>
               <w:br/>
               <w:t>export class LoginPage {</w:t>
               <w:br/>
@@ -639,7 +816,15 @@
               <w:br/>
               <w:t xml:space="preserve">  }</w:t>
               <w:br/>
+              <w:br/>
+              <w:t xml:space="preserve">  async getFlashMessageText(): Promise&lt;string&gt; {</w:t>
+              <w:br/>
+              <w:t xml:space="preserve">    return await this.flashMessage.textContent() || '';</w:t>
+              <w:br/>
+              <w:t xml:space="preserve">  }</w:t>
+              <w:br/>
               <w:t>}</w:t>
+              <w:br/>
             </w:r>
           </w:p>
         </w:tc>
@@ -659,9 +844,9 @@
           <w:rFonts w:ascii="Arial" w:hAnsi="Arial"/>
           <w:b/>
           <w:color w:val="41748D"/>
-          <w:sz w:val="28"/>
+          <w:sz w:val="26"/>
         </w:rPr>
-        <w:t>API Testing with REST Assured (Java)</w:t>
+        <w:t>3.3 Enterprise API Testing with REST Assured (Java)</w:t>
       </w:r>
     </w:p>
     <w:p>
@@ -674,7 +859,7 @@
           <w:color w:val="333333"/>
           <w:sz w:val="22"/>
         </w:rPr>
-        <w:t>Enterprise backend validation requires contract validation, schema checks, and robust status assertions:</w:t>
+        <w:t>Backend microservices validation requires robust contract testing, JSON payload parsing, and schema validation.</w:t>
       </w:r>
     </w:p>
     <w:tbl>
@@ -703,7 +888,7 @@
                 <w:color w:val="A0AEC0"/>
                 <w:sz w:val="18"/>
               </w:rPr>
-              <w:t>💻 REST Assured API Test (ApiTest.java)</w:t>
+              <w:t>💻 ApiTest.java (REST Assured API Test Suite)</w:t>
               <w:br/>
             </w:r>
           </w:p>
@@ -722,20 +907,33 @@
               <w:br/>
               <w:t>import org.junit.jupiter.api.Test;</w:t>
               <w:br/>
+              <w:t>import org.junit.jupiter.api.DisplayName;</w:t>
+              <w:br/>
               <w:t>import static io.restassured.RestAssured.*;</w:t>
               <w:br/>
               <w:t>import static org.hamcrest.Matchers.*;</w:t>
               <w:br/>
               <w:br/>
+              <w:t>/**</w:t>
+              <w:br/>
+              <w:t xml:space="preserve"> * Enterprise API Test Suite using REST Assured against JSONPlaceholder</w:t>
+              <w:br/>
+              <w:t xml:space="preserve"> */</w:t>
+              <w:br/>
               <w:t>public class ApiTest {</w:t>
               <w:br/>
+              <w:br/>
               <w:t xml:space="preserve">    @Test</w:t>
+              <w:br/>
+              <w:t xml:space="preserve">    @DisplayName("Validate GET /posts/1 returns valid schema and resource ID")</w:t>
               <w:br/>
               <w:t xml:space="preserve">    void testGetPostValidatesSuccessfully() {</w:t>
               <w:br/>
               <w:t xml:space="preserve">        given()</w:t>
               <w:br/>
               <w:t xml:space="preserve">            .baseUri("https://jsonplaceholder.typicode.com")</w:t>
+              <w:br/>
+              <w:t xml:space="preserve">            .header("Accept", "application/json")</w:t>
               <w:br/>
               <w:t xml:space="preserve">        .when()</w:t>
               <w:br/>
@@ -747,11 +945,56 @@
               <w:br/>
               <w:t xml:space="preserve">            .body("id", equalTo(1))</w:t>
               <w:br/>
-              <w:t xml:space="preserve">            .body("title", notNullValue());</w:t>
+              <w:t xml:space="preserve">            .body("userId", notNullValue())</w:t>
+              <w:br/>
+              <w:t xml:space="preserve">            .body("title", notNullValue())</w:t>
+              <w:br/>
+              <w:t xml:space="preserve">            .body("body", notNullValue());</w:t>
+              <w:br/>
+              <w:t xml:space="preserve">            </w:t>
+              <w:br/>
+              <w:t xml:space="preserve">        System.out.println("API Test PASSED: GET /posts/1 validated successfully.");</w:t>
+              <w:br/>
+              <w:t xml:space="preserve">    }</w:t>
+              <w:br/>
+              <w:br/>
+              <w:t xml:space="preserve">    @Test</w:t>
+              <w:br/>
+              <w:t xml:space="preserve">    @DisplayName("Validate POST /posts successfully creates a new resource")</w:t>
+              <w:br/>
+              <w:t xml:space="preserve">    void testPostResourceCreation() {</w:t>
+              <w:br/>
+              <w:t xml:space="preserve">        String jsonBody = "{"title": "Enterprise QE", "body": "Automation Track", "userId": 42}";</w:t>
+              <w:br/>
+              <w:br/>
+              <w:t xml:space="preserve">        given()</w:t>
+              <w:br/>
+              <w:t xml:space="preserve">            .baseUri("https://jsonplaceholder.typicode.com")</w:t>
+              <w:br/>
+              <w:t xml:space="preserve">            .contentType("application/json; charset=UTF-8")</w:t>
+              <w:br/>
+              <w:t xml:space="preserve">            .body(jsonBody)</w:t>
+              <w:br/>
+              <w:t xml:space="preserve">        .when()</w:t>
+              <w:br/>
+              <w:t xml:space="preserve">            .post("/posts")</w:t>
+              <w:br/>
+              <w:t xml:space="preserve">        .then()</w:t>
+              <w:br/>
+              <w:t xml:space="preserve">            .statusCode(201)</w:t>
+              <w:br/>
+              <w:t xml:space="preserve">            .body("id", notNullValue())</w:t>
+              <w:br/>
+              <w:t xml:space="preserve">            .body("title", equalTo("Enterprise QE"));</w:t>
+              <w:br/>
+              <w:t xml:space="preserve">            </w:t>
+              <w:br/>
+              <w:t xml:space="preserve">        System.out.println("API Test PASSED: POST /posts resource created successfully.");</w:t>
               <w:br/>
               <w:t xml:space="preserve">    }</w:t>
               <w:br/>
               <w:t>}</w:t>
+              <w:br/>
             </w:r>
           </w:p>
         </w:tc>
@@ -764,16 +1007,16 @@
     </w:p>
     <w:p>
       <w:pPr>
-        <w:spacing w:before="360" w:after="120"/>
+        <w:spacing w:before="320" w:after="120"/>
       </w:pPr>
       <w:r>
         <w:rPr>
           <w:rFonts w:ascii="Arial" w:hAnsi="Arial"/>
           <w:b/>
           <w:color w:val="1B365D"/>
-          <w:sz w:val="36"/>
+          <w:sz w:val="32"/>
         </w:rPr>
-        <w:t>4. Phase 3: DevOps, CI/CD, Performance &amp; Governance Integration</w:t>
+        <w:t>Chapter 4: Phase 3 - DevOps Quality Gates, Environment Management &amp; Performance Engineering</w:t>
       </w:r>
     </w:p>
     <w:p>
@@ -786,7 +1029,7 @@
           <w:color w:val="333333"/>
           <w:sz w:val="22"/>
         </w:rPr>
-        <w:t>Engineering managers must enforce quality gates in pipelines (GitHub Actions, Azure DevOps, AWS CodePipeline) and establish performance SLAs.</w:t>
+        <w:t>Phase 3 integrates automated quality gates into CI/CD pipelines (GitHub Actions, Azure DevOps) and establishes performance engineering discipline.</w:t>
       </w:r>
     </w:p>
     <w:p>
@@ -798,9 +1041,9 @@
           <w:rFonts w:ascii="Arial" w:hAnsi="Arial"/>
           <w:b/>
           <w:color w:val="41748D"/>
-          <w:sz w:val="28"/>
+          <w:sz w:val="26"/>
         </w:rPr>
-        <w:t>Pipeline Quality Gate Engine (Java)</w:t>
+        <w:t>4.1 Pipeline Quality Gate Architecture</w:t>
       </w:r>
     </w:p>
     <w:p>
@@ -813,7 +1056,7 @@
           <w:color w:val="333333"/>
           <w:sz w:val="22"/>
         </w:rPr>
-        <w:t>A programmatic gate evaluating test execution results, coverage thresholds, and response time SLAs before artifact promotion:</w:t>
+        <w:t>Quality gates act as automated circuit breakers in continuous delivery pipelines. If code quality, test pass rates, code coverage, or response time thresholds are breached, artifact promotion is immediately halted.</w:t>
       </w:r>
     </w:p>
     <w:tbl>
@@ -842,7 +1085,7 @@
                 <w:color w:val="A0AEC0"/>
                 <w:sz w:val="18"/>
               </w:rPr>
-              <w:t>💻 ReleaseQualityGate.java</w:t>
+              <w:t>💻 ReleaseQualityGate.java (Java Quality Gate Engine)</w:t>
               <w:br/>
             </w:r>
           </w:p>
@@ -859,23 +1102,66 @@
               <w:t>package enterprise.qe.gates;</w:t>
               <w:br/>
               <w:br/>
+              <w:t>/**</w:t>
+              <w:br/>
+              <w:t xml:space="preserve"> * Programmatic Enterprise Release Quality Gate Evaluator</w:t>
+              <w:br/>
+              <w:t xml:space="preserve"> */</w:t>
+              <w:br/>
               <w:t>public class ReleaseQualityGate {</w:t>
               <w:br/>
-              <w:t xml:space="preserve">    public static boolean isReleaseReady(int failedTests, double coverage, int criticalBugs, double avgResponseTime) {</w:t>
               <w:br/>
-              <w:t xml:space="preserve">        if (failedTests &gt; 0) return false;</w:t>
+              <w:t xml:space="preserve">    public static boolean isReleaseReady(int failedTests, double coveragePercentage, int criticalBugs, double avgResponseTimeMs) {</w:t>
               <w:br/>
-              <w:t xml:space="preserve">        if (coverage &lt; 80.0) return false;</w:t>
+              <w:t xml:space="preserve">        if (failedTests &gt; 0) {</w:t>
               <w:br/>
-              <w:t xml:space="preserve">        if (criticalBugs &gt; 0) return false;</w:t>
+              <w:t xml:space="preserve">            System.out.println("Gate Failed: Outstanding test failures detected.");</w:t>
               <w:br/>
-              <w:t xml:space="preserve">        if (avgResponseTime &gt; 2000) return false;</w:t>
+              <w:t xml:space="preserve">            return false;</w:t>
+              <w:br/>
+              <w:t xml:space="preserve">        }</w:t>
+              <w:br/>
+              <w:t xml:space="preserve">        if (coveragePercentage &lt; 80.0) {</w:t>
+              <w:br/>
+              <w:t xml:space="preserve">            System.out.println("Gate Failed: Test coverage below enterprise minimum (80%).");</w:t>
+              <w:br/>
+              <w:t xml:space="preserve">            return false;</w:t>
+              <w:br/>
+              <w:t xml:space="preserve">        }</w:t>
+              <w:br/>
+              <w:t xml:space="preserve">        if (criticalBugs &gt; 0) {</w:t>
+              <w:br/>
+              <w:t xml:space="preserve">            System.out.println("Gate Failed: Unresolved critical defects present.");</w:t>
+              <w:br/>
+              <w:t xml:space="preserve">            return false;</w:t>
+              <w:br/>
+              <w:t xml:space="preserve">        }</w:t>
+              <w:br/>
+              <w:t xml:space="preserve">        if (avgResponseTimeMs &gt; 2000.0) {</w:t>
+              <w:br/>
+              <w:t xml:space="preserve">            System.out.println("Gate Failed: Response time SLA breached (&gt;2000ms).");</w:t>
+              <w:br/>
+              <w:t xml:space="preserve">            return false;</w:t>
+              <w:br/>
+              <w:t xml:space="preserve">        }</w:t>
+              <w:br/>
+              <w:t xml:space="preserve">        System.out.println("Gate PASSED: Release candidate meets all quality criteria.");</w:t>
               <w:br/>
               <w:t xml:space="preserve">        return true;</w:t>
               <w:br/>
               <w:t xml:space="preserve">    }</w:t>
               <w:br/>
+              <w:br/>
+              <w:t xml:space="preserve">    public static void main(String[] args) {</w:t>
+              <w:br/>
+              <w:t xml:space="preserve">        boolean ready = isReleaseReady(0, 85.5, 0, 1450.0);</w:t>
+              <w:br/>
+              <w:t xml:space="preserve">        System.out.println("Deployment Approved: " + ready);</w:t>
+              <w:br/>
+              <w:t xml:space="preserve">    }</w:t>
+              <w:br/>
               <w:t>}</w:t>
+              <w:br/>
             </w:r>
           </w:p>
         </w:tc>
@@ -895,9 +1181,9 @@
           <w:rFonts w:ascii="Arial" w:hAnsi="Arial"/>
           <w:b/>
           <w:color w:val="41748D"/>
-          <w:sz w:val="28"/>
+          <w:sz w:val="26"/>
         </w:rPr>
-        <w:t>Performance Testing with Locust (Python)</w:t>
+        <w:t>4.2 API Performance Engineering with Locust (Python)</w:t>
       </w:r>
     </w:p>
     <w:p>
@@ -910,7 +1196,7 @@
           <w:color w:val="333333"/>
           <w:sz w:val="22"/>
         </w:rPr>
-        <w:t>Simulating concurrent user load against microservices in pre-prod or CI/CD environments:</w:t>
+        <w:t>Performance testing verifies system scalability, throughput, and latency under heavy concurrent user load.</w:t>
       </w:r>
     </w:p>
     <w:tbl>
@@ -939,7 +1225,7 @@
                 <w:color w:val="A0AEC0"/>
                 <w:sz w:val="18"/>
               </w:rPr>
-              <w:t>💻 Locust API Performance Test (api_performance_test.py)</w:t>
+              <w:t>💻 api_performance_test.py (Locust Load Testing)</w:t>
               <w:br/>
             </w:r>
           </w:p>
@@ -956,25 +1242,40 @@
               <w:t>from locust import HttpUser, task, between</w:t>
               <w:br/>
               <w:br/>
-              <w:t>class WebsiteUser(HttpUser):</w:t>
+              <w:t>class EnterpriseApiUser(HttpUser):</w:t>
               <w:br/>
-              <w:t xml:space="preserve">    wait_time = between(1, 2)</w:t>
+              <w:t xml:space="preserve">    wait_time = between(1, 2)  # Think time between user requests</w:t>
               <w:br/>
               <w:br/>
-              <w:t xml:space="preserve">    @task</w:t>
+              <w:t xml:space="preserve">    @task(2)</w:t>
               <w:br/>
-              <w:t xml:space="preserve">    def get_posts(self):</w:t>
+              <w:t xml:space="preserve">    def get_post_details(self):</w:t>
+              <w:br/>
+              <w:t xml:space="preserve">        # Simulate high-frequency read traffic</w:t>
               <w:br/>
               <w:t xml:space="preserve">        self.client.get("/posts/1", name="/posts/[id]")</w:t>
               <w:br/>
               <w:br/>
-              <w:t xml:space="preserve">    @task(3)</w:t>
+              <w:t xml:space="preserve">    @task(1)</w:t>
               <w:br/>
-              <w:t xml:space="preserve">    def create_post(self):</w:t>
+              <w:t xml:space="preserve">    def create_new_record(self):</w:t>
               <w:br/>
-              <w:t xml:space="preserve">        payload = {"title": "load-test", "body": "test-body", "userId": 1}</w:t>
+              <w:t xml:space="preserve">        # Simulate write/creation transaction load</w:t>
               <w:br/>
-              <w:t xml:space="preserve">        self.client.post("/posts", json=payload)</w:t>
+              <w:t xml:space="preserve">        payload = {</w:t>
+              <w:br/>
+              <w:t xml:space="preserve">            "title": "Enterprise Load Test",</w:t>
+              <w:br/>
+              <w:t xml:space="preserve">            "body": "Performance validation under concurrency",</w:t>
+              <w:br/>
+              <w:t xml:space="preserve">            "userId": 99</w:t>
+              <w:br/>
+              <w:t xml:space="preserve">        }</w:t>
+              <w:br/>
+              <w:t xml:space="preserve">        headers = {"Content-Type": "application/json; charset=UTF-8"}</w:t>
+              <w:br/>
+              <w:t xml:space="preserve">        self.client.post("/posts", json=payload, headers=headers, name="/posts (Create)")</w:t>
+              <w:br/>
             </w:r>
           </w:p>
         </w:tc>
@@ -987,16 +1288,16 @@
     </w:p>
     <w:p>
       <w:pPr>
-        <w:spacing w:before="360" w:after="120"/>
+        <w:spacing w:before="320" w:after="120"/>
       </w:pPr>
       <w:r>
         <w:rPr>
           <w:rFonts w:ascii="Arial" w:hAnsi="Arial"/>
           <w:b/>
           <w:color w:val="1B365D"/>
-          <w:sz w:val="36"/>
+          <w:sz w:val="32"/>
         </w:rPr>
-        <w:t>5. Phase 4: Advanced AI Governance Architecture</w:t>
+        <w:t>Chapter 5: Phase 4 - Advanced AI Governance Architecture</w:t>
       </w:r>
     </w:p>
     <w:p>
@@ -1009,7 +1310,7 @@
           <w:color w:val="333333"/>
           <w:sz w:val="22"/>
         </w:rPr>
-        <w:t>The cutting edge of enterprise QA leadership requires mastering three pivotal architectural patterns:</w:t>
+        <w:t>The bleeding edge of enterprise QA leadership requires mastering advanced governance architectures that make automated AI decisions defensible and reliable.</w:t>
       </w:r>
     </w:p>
     <w:p>
@@ -1021,9 +1322,9 @@
           <w:rFonts w:ascii="Arial" w:hAnsi="Arial"/>
           <w:b/>
           <w:color w:val="41748D"/>
-          <w:sz w:val="28"/>
+          <w:sz w:val="26"/>
         </w:rPr>
-        <w:t>Trust Architecture &amp; Explainability Logs</w:t>
+        <w:t>5.1 Trust Architecture &amp; Explainability Audit Logs</w:t>
       </w:r>
     </w:p>
     <w:p>
@@ -1036,7 +1337,76 @@
           <w:color w:val="333333"/>
           <w:sz w:val="22"/>
         </w:rPr>
-        <w:t>Corporate boards and regulators require that automated AI pipeline decisions are defensible. Trust Architecture mandates structured audit logs containing model versions, rubrics, input context, and confidence scores.</w:t>
+        <w:t>When an enterprise AI pipeline automatically blocks a deployment or synthesizes compliance data, corporate boards, internal auditors, and external regulators demand absolute explainability. Trust Architecture mandates that every AI-driven gate decision produces an immutable audit record containing:</w:t>
+      </w:r>
+    </w:p>
+    <w:p>
+      <w:pPr>
+        <w:pStyle w:val="ListBullet"/>
+        <w:spacing w:after="60" w:line="276" w:lineRule="auto"/>
+      </w:pPr>
+      <w:r>
+        <w:rPr>
+          <w:rFonts w:ascii="Calibri" w:hAnsi="Calibri"/>
+          <w:b/>
+          <w:color w:val="2C3E50"/>
+          <w:sz w:val="22"/>
+        </w:rPr>
+        <w:t xml:space="preserve">Model Provenance: </w:t>
+      </w:r>
+      <w:r>
+        <w:rPr>
+          <w:rFonts w:ascii="Calibri" w:hAnsi="Calibri"/>
+          <w:color w:val="333333"/>
+          <w:sz w:val="22"/>
+        </w:rPr>
+        <w:t>Exact model identifier and prompt hash used during evaluation.</w:t>
+      </w:r>
+    </w:p>
+    <w:p>
+      <w:pPr>
+        <w:pStyle w:val="ListBullet"/>
+        <w:spacing w:after="60" w:line="276" w:lineRule="auto"/>
+      </w:pPr>
+      <w:r>
+        <w:rPr>
+          <w:rFonts w:ascii="Calibri" w:hAnsi="Calibri"/>
+          <w:b/>
+          <w:color w:val="2C3E50"/>
+          <w:sz w:val="22"/>
+        </w:rPr>
+        <w:t xml:space="preserve">Rubric &amp; Thresholds: </w:t>
+      </w:r>
+      <w:r>
+        <w:rPr>
+          <w:rFonts w:ascii="Calibri" w:hAnsi="Calibri"/>
+          <w:color w:val="333333"/>
+          <w:sz w:val="22"/>
+        </w:rPr>
+        <w:t>The precise risk rubric, coverage threshold, or safety boundary applied.</w:t>
+      </w:r>
+    </w:p>
+    <w:p>
+      <w:pPr>
+        <w:pStyle w:val="ListBullet"/>
+        <w:spacing w:after="60" w:line="276" w:lineRule="auto"/>
+      </w:pPr>
+      <w:r>
+        <w:rPr>
+          <w:rFonts w:ascii="Calibri" w:hAnsi="Calibri"/>
+          <w:b/>
+          <w:color w:val="2C3E50"/>
+          <w:sz w:val="22"/>
+        </w:rPr>
+        <w:t xml:space="preserve">Explainability Trail: </w:t>
+      </w:r>
+      <w:r>
+        <w:rPr>
+          <w:rFonts w:ascii="Calibri" w:hAnsi="Calibri"/>
+          <w:color w:val="333333"/>
+          <w:sz w:val="22"/>
+        </w:rPr>
+        <w:t>Granular reasoning explaining why an artifact was approved or rejected.</w:t>
       </w:r>
     </w:p>
     <w:p>
@@ -1048,9 +1418,9 @@
           <w:rFonts w:ascii="Arial" w:hAnsi="Arial"/>
           <w:b/>
           <w:color w:val="41748D"/>
-          <w:sz w:val="28"/>
+          <w:sz w:val="26"/>
         </w:rPr>
-        <w:t>LLM-as-a-Judge Evaluation Harness</w:t>
+        <w:t>5.2 LLM-as-a-Judge Evaluation Pattern</w:t>
       </w:r>
     </w:p>
     <w:p>
@@ -1063,7 +1433,7 @@
           <w:color w:val="333333"/>
           <w:sz w:val="22"/>
         </w:rPr>
-        <w:t>When testing unstructured AI outputs (e.g., chat assistants, dynamic JSON payloads), traditional assertions fail. We use a foundational model as a programmatic test judge:</w:t>
+        <w:t>Traditional programmatic assertions (`assertEquals`, `regex match`) fail when evaluating unstructured AI outputs (e.g., conversational assistant responses, dynamic JSON microservice payloads). The 'LLM-as-a-Judge' architectural pattern deploys a robust foundational model as a programmatic test assertion.</w:t>
       </w:r>
     </w:p>
     <w:tbl>
@@ -1092,7 +1462,7 @@
                 <w:color w:val="A0AEC0"/>
                 <w:sz w:val="18"/>
               </w:rPr>
-              <w:t>💻 LLM-as-a-Judge Evaluator (llm_judge_evaluator.py)</w:t>
+              <w:t>💻 llm_judge_evaluator.py (LLM-as-a-Judge Harness)</w:t>
               <w:br/>
             </w:r>
           </w:p>
@@ -1111,31 +1481,96 @@
               <w:br/>
               <w:t>class LLMJudgeEvaluator:</w:t>
               <w:br/>
+              <w:t xml:space="preserve">    """</w:t>
+              <w:br/>
+              <w:t xml:space="preserve">    Implements the 'LLM-as-a-Judge' architectural pattern and 'Trust Architecture'</w:t>
+              <w:br/>
+              <w:t xml:space="preserve">    governance logging for evaluating complex system outputs against enterprise risk rubrics.</w:t>
+              <w:br/>
+              <w:t xml:space="preserve">    """</w:t>
+              <w:br/>
+              <w:t xml:space="preserve">    def __init__(self, model_identifier: str = "enterprise-eval-llm-v2"):</w:t>
+              <w:br/>
+              <w:t xml:space="preserve">        self.model_identifier = model_identifier</w:t>
+              <w:br/>
+              <w:br/>
               <w:t xml:space="preserve">    def evaluate_output(self, system_output: str, risk_rubric: dict) -&gt; dict:</w:t>
+              <w:br/>
+              <w:t xml:space="preserve">        print(f"[{self.model_identifier}] Evaluating system output against enterprise risk rubric...")</w:t>
+              <w:br/>
+              <w:t xml:space="preserve">        </w:t>
               <w:br/>
               <w:t xml:space="preserve">        score = 100</w:t>
               <w:br/>
               <w:t xml:space="preserve">        violations = []</w:t>
               <w:br/>
+              <w:br/>
               <w:t xml:space="preserve">        if "error" in system_output.lower() and not risk_rubric.get("allow_errors", False):</w:t>
               <w:br/>
               <w:t xml:space="preserve">            score -= 40</w:t>
               <w:br/>
-              <w:t xml:space="preserve">            violations.append("Uncaught error terminology detected.")</w:t>
+              <w:t xml:space="preserve">            violations.append("Uncaught error or exception terminology detected in output.")</w:t>
               <w:br/>
-              <w:t xml:space="preserve">            </w:t>
               <w:br/>
-              <w:t xml:space="preserve">        passed = score &gt;= risk_rubric.get("passing_threshold", 70)</w:t>
+              <w:t xml:space="preserve">        if len(system_output) &lt; risk_rubric.get("min_length", 10):</w:t>
               <w:br/>
-              <w:t xml:space="preserve">        return {</w:t>
+              <w:t xml:space="preserve">            score -= 30</w:t>
               <w:br/>
-              <w:t xml:space="preserve">            "score": score,</w:t>
+              <w:t xml:space="preserve">            violations.append("Output fails minimum length and detail threshold.")</w:t>
               <w:br/>
-              <w:t xml:space="preserve">            "passed": passed,</w:t>
               <w:br/>
-              <w:t xml:space="preserve">            "explainability_reasoning": violations if violations else ["Passed safety &amp; quality boundaries."]</w:t>
+              <w:t xml:space="preserve">        passed = score &gt;= risk_rubric.get("passing_threshold", 80)</w:t>
+              <w:br/>
+              <w:br/>
+              <w:t xml:space="preserve">        # Trust Architecture Audit Log Record</w:t>
+              <w:br/>
+              <w:t xml:space="preserve">        audit_record = {</w:t>
+              <w:br/>
+              <w:t xml:space="preserve">            "evaluator_model": self.model_identifier,</w:t>
+              <w:br/>
+              <w:t xml:space="preserve">            "input_sample": system_output[:120],</w:t>
+              <w:br/>
+              <w:t xml:space="preserve">            "rubric_applied": risk_rubric,</w:t>
+              <w:br/>
+              <w:t xml:space="preserve">            "calculated_score": score,</w:t>
+              <w:br/>
+              <w:t xml:space="preserve">            "gate_passed": passed,</w:t>
+              <w:br/>
+              <w:t xml:space="preserve">            "explainability_reasoning": violations if violations else ["Output successfully complies with all safety and quality boundaries."]</w:t>
               <w:br/>
               <w:t xml:space="preserve">        }</w:t>
+              <w:br/>
+              <w:t xml:space="preserve">        return audit_record</w:t>
+              <w:br/>
+              <w:br/>
+              <w:t>if __name__ == "__main__":</w:t>
+              <w:br/>
+              <w:t xml:space="preserve">    print("=== LLM-as-a-Judge &amp; Trust Architecture Enterprise Harness ===")</w:t>
+              <w:br/>
+              <w:t xml:space="preserve">    </w:t>
+              <w:br/>
+              <w:t xml:space="preserve">    judge = LLMJudgeEvaluator()</w:t>
+              <w:br/>
+              <w:t xml:space="preserve">    rubric = {"passing_threshold": 80, "min_length": 15, "allow_errors": False}</w:t>
+              <w:br/>
+              <w:br/>
+              <w:t xml:space="preserve">    output_pass = "Welcome to enterprise support. Your request #9021 has been successfully processed and verified."</w:t>
+              <w:br/>
+              <w:t xml:space="preserve">    result1 = judge.evaluate_output(output_pass, rubric)</w:t>
+              <w:br/>
+              <w:t xml:space="preserve">    print("Evaluation 1 Report:\n", json.dumps(result1, indent=2))</w:t>
+              <w:br/>
+              <w:t xml:space="preserve">    print("-" * 60)</w:t>
+              <w:br/>
+              <w:br/>
+              <w:t xml:space="preserve">    output_fail = "Internal Server Error 500."</w:t>
+              <w:br/>
+              <w:t xml:space="preserve">    result2 = judge.evaluate_output(output_fail, rubric)</w:t>
+              <w:br/>
+              <w:t xml:space="preserve">    print("Evaluation 2 Report:\n", json.dumps(result2, indent=2))</w:t>
+              <w:br/>
+              <w:t xml:space="preserve">    print("-" * 60)</w:t>
+              <w:br/>
             </w:r>
           </w:p>
         </w:tc>
@@ -1155,9 +1590,9 @@
           <w:rFonts w:ascii="Arial" w:hAnsi="Arial"/>
           <w:b/>
           <w:color w:val="41748D"/>
-          <w:sz w:val="28"/>
+          <w:sz w:val="26"/>
         </w:rPr>
-        <w:t>Shift-Right Integration &amp; Production Telemetry</w:t>
+        <w:t>5.3 Shift-Right Integration &amp; Production Telemetry</w:t>
       </w:r>
     </w:p>
     <w:p>
@@ -1170,21 +1605,21 @@
           <w:color w:val="333333"/>
           <w:sz w:val="22"/>
         </w:rPr>
-        <w:t>Moving beyond staging by integrating automated synthetic canary tests and APM telemetry feedback loops directly into production environments.</w:t>
+        <w:t>Traditional testing stops at pre-production staging. Shift-Right integration extends quality validation directly into live production environments using OpenTelemetry, synthetic canary testing, real-time error budget tracking, and automated feedback loops that convert production incidents into regression test suites.</w:t>
       </w:r>
     </w:p>
     <w:p>
       <w:pPr>
-        <w:spacing w:before="360" w:after="120"/>
+        <w:spacing w:before="320" w:after="120"/>
       </w:pPr>
       <w:r>
         <w:rPr>
           <w:rFonts w:ascii="Arial" w:hAnsi="Arial"/>
           <w:b/>
           <w:color w:val="1B365D"/>
-          <w:sz w:val="36"/>
+          <w:sz w:val="32"/>
         </w:rPr>
-        <w:t>6. Real-World Enterprise Blueprint: Azure, AWS &amp; Agentic Tooling</w:t>
+        <w:t>Chapter 6: Real-World Enterprise Cloud Topologies (Azure, AWS, OpenClaw)</w:t>
       </w:r>
     </w:p>
     <w:p>
@@ -1197,7 +1632,21 @@
           <w:color w:val="333333"/>
           <w:sz w:val="22"/>
         </w:rPr>
-        <w:t>How Fortune 500 engineering organizations (Verizon, Trimble, CIBC) apply these exact patterns in production today:</w:t>
+        <w:t>To succeed in interviews and executive leadership at companies like Verizon, Trimble, CIBC, and Palo Alto Networks, engineering managers must understand how cloud ecosystems implement these exact patterns in production:</w:t>
+      </w:r>
+    </w:p>
+    <w:p>
+      <w:pPr>
+        <w:spacing w:before="240" w:after="80"/>
+      </w:pPr>
+      <w:r>
+        <w:rPr>
+          <w:rFonts w:ascii="Arial" w:hAnsi="Arial"/>
+          <w:b/>
+          <w:color w:val="41748D"/>
+          <w:sz w:val="26"/>
+        </w:rPr>
+        <w:t>6.1 Microsoft Azure AI Ecosystem</w:t>
       </w:r>
     </w:p>
     <w:p>
@@ -1212,7 +1661,7 @@
           <w:color w:val="2C3E50"/>
           <w:sz w:val="22"/>
         </w:rPr>
-        <w:t xml:space="preserve">Microsoft Azure AI Ecosystem: </w:t>
+        <w:t xml:space="preserve">Azure OpenAI &amp; Private Endpoints: </w:t>
       </w:r>
       <w:r>
         <w:rPr>
@@ -1220,7 +1669,7 @@
           <w:color w:val="333333"/>
           <w:sz w:val="22"/>
         </w:rPr>
-        <w:t>Deploying Azure OpenAI Service (GPT-4o) behind enterprise private endpoints for test data synthesis and LLM-as-a-Judge validation pipelines.</w:t>
+        <w:t>Deploying Azure OpenAI Service (GPT-4o) behind private virtual network endpoints. This ensures zero data leakage while allowing enterprise QE teams to synthesize synthetic test data, generate automated unit tests, and execute LLM-as-a-Judge evaluations securely within corporate compliance boundaries.</w:t>
       </w:r>
     </w:p>
     <w:p>
@@ -1235,7 +1684,7 @@
           <w:color w:val="2C3E50"/>
           <w:sz w:val="22"/>
         </w:rPr>
-        <w:t xml:space="preserve">AWS Bedrock &amp; Cloud Testing: </w:t>
+        <w:t xml:space="preserve">Azure DevOps &amp; Containerization: </w:t>
       </w:r>
       <w:r>
         <w:rPr>
@@ -1243,7 +1692,21 @@
           <w:color w:val="333333"/>
           <w:sz w:val="22"/>
         </w:rPr>
-        <w:t>Leveraging Amazon Bedrock with Anthropic Claude for secure, cross-region LLM agent integrations and test orchestration.</w:t>
+        <w:t>Automating infrastructure provisioning, test runners, and performance test nodes using Azure Container Instances and Azure Pipelines.</w:t>
+      </w:r>
+    </w:p>
+    <w:p>
+      <w:pPr>
+        <w:spacing w:before="240" w:after="80"/>
+      </w:pPr>
+      <w:r>
+        <w:rPr>
+          <w:rFonts w:ascii="Arial" w:hAnsi="Arial"/>
+          <w:b/>
+          <w:color w:val="41748D"/>
+          <w:sz w:val="26"/>
+        </w:rPr>
+        <w:t>6.2 Amazon Web Services (AWS) Bedrock &amp; Serverless QA</w:t>
       </w:r>
     </w:p>
     <w:p>
@@ -1258,7 +1721,7 @@
           <w:color w:val="2C3E50"/>
           <w:sz w:val="22"/>
         </w:rPr>
-        <w:t xml:space="preserve">Agentic Tooling &amp; MCP Servers: </w:t>
+        <w:t xml:space="preserve">AWS Bedrock &amp; Multi-Model Inference: </w:t>
       </w:r>
       <w:r>
         <w:rPr>
@@ -1266,7 +1729,138 @@
           <w:color w:val="333333"/>
           <w:sz w:val="22"/>
         </w:rPr>
-        <w:t>Using agentic frameworks (custom Python agents and Model Context Protocol servers) to securely connect LLM agents to internal Jira, GitHub, and CI/CD pipelines.</w:t>
+        <w:t>Leveraging Amazon Bedrock for cross-region model inference, choosing optimal foundational models (Anthropic Claude 3.5 Sonnet) for test orchestration and automated code review.</w:t>
+      </w:r>
+    </w:p>
+    <w:p>
+      <w:pPr>
+        <w:pStyle w:val="ListBullet"/>
+        <w:spacing w:after="60" w:line="276" w:lineRule="auto"/>
+      </w:pPr>
+      <w:r>
+        <w:rPr>
+          <w:rFonts w:ascii="Calibri" w:hAnsi="Calibri"/>
+          <w:b/>
+          <w:color w:val="2C3E50"/>
+          <w:sz w:val="22"/>
+        </w:rPr>
+        <w:t xml:space="preserve">Serverless Test Infrastructure: </w:t>
+      </w:r>
+      <w:r>
+        <w:rPr>
+          <w:rFonts w:ascii="Calibri" w:hAnsi="Calibri"/>
+          <w:color w:val="333333"/>
+          <w:sz w:val="22"/>
+        </w:rPr>
+        <w:t>Executing serverless test workers using AWS Lambda and ECS Fargate to scale out distributed test execution across thousands of parallel threads without managing infrastructure.</w:t>
+      </w:r>
+    </w:p>
+    <w:p>
+      <w:pPr>
+        <w:spacing w:before="240" w:after="80"/>
+      </w:pPr>
+      <w:r>
+        <w:rPr>
+          <w:rFonts w:ascii="Arial" w:hAnsi="Arial"/>
+          <w:b/>
+          <w:color w:val="41748D"/>
+          <w:sz w:val="26"/>
+        </w:rPr>
+        <w:t>6.3 Agentic Tooling &amp; OpenClaw Frameworks</w:t>
+      </w:r>
+    </w:p>
+    <w:p>
+      <w:pPr>
+        <w:spacing w:after="120" w:line="276" w:lineRule="auto"/>
+      </w:pPr>
+      <w:r>
+        <w:rPr>
+          <w:rFonts w:ascii="Calibri" w:hAnsi="Calibri"/>
+          <w:color w:val="333333"/>
+          <w:sz w:val="22"/>
+        </w:rPr>
+        <w:t>Modern engineering organizations utilize custom Python agentic frameworks (often integrating open-source agent runtimes like OpenClaw) to create autonomous QE co-pilots that continuously monitor code repositories, triage flaky tests, automatically open Jira bug tickets with full reproduction steps, and verify pull request compliance.</w:t>
+      </w:r>
+    </w:p>
+    <w:p>
+      <w:pPr>
+        <w:spacing w:before="320" w:after="120"/>
+      </w:pPr>
+      <w:r>
+        <w:rPr>
+          <w:rFonts w:ascii="Arial" w:hAnsi="Arial"/>
+          <w:b/>
+          <w:color w:val="1B365D"/>
+          <w:sz w:val="32"/>
+        </w:rPr>
+        <w:t>Chapter 7: Executive QE Leadership, Cultural Transformation &amp; Metrics</w:t>
+      </w:r>
+    </w:p>
+    <w:p>
+      <w:pPr>
+        <w:spacing w:after="120" w:line="276" w:lineRule="auto"/>
+      </w:pPr>
+      <w:r>
+        <w:rPr>
+          <w:rFonts w:ascii="Calibri" w:hAnsi="Calibri"/>
+          <w:color w:val="333333"/>
+          <w:sz w:val="22"/>
+        </w:rPr>
+        <w:t>Technical mastery must be paired with executive leadership, stakeholder management, and team coaching.</w:t>
+      </w:r>
+    </w:p>
+    <w:p>
+      <w:pPr>
+        <w:spacing w:before="240" w:after="80"/>
+      </w:pPr>
+      <w:r>
+        <w:rPr>
+          <w:rFonts w:ascii="Arial" w:hAnsi="Arial"/>
+          <w:b/>
+          <w:color w:val="41748D"/>
+          <w:sz w:val="26"/>
+        </w:rPr>
+        <w:t>7.1 The Automation-First Culture &amp; Developer-Owned Quality</w:t>
+      </w:r>
+    </w:p>
+    <w:p>
+      <w:pPr>
+        <w:spacing w:after="120" w:line="276" w:lineRule="auto"/>
+      </w:pPr>
+      <w:r>
+        <w:rPr>
+          <w:rFonts w:ascii="Calibri" w:hAnsi="Calibri"/>
+          <w:color w:val="333333"/>
+          <w:sz w:val="22"/>
+        </w:rPr>
+        <w:t>Senior managers drive a culture where quality is a shared engineering responsibility. Developers own unit and integration tests, while QE leadership focuses on E2E strategy, performance architecture, governance, and coaching.</w:t>
+      </w:r>
+    </w:p>
+    <w:p>
+      <w:pPr>
+        <w:spacing w:before="240" w:after="80"/>
+      </w:pPr>
+      <w:r>
+        <w:rPr>
+          <w:rFonts w:ascii="Arial" w:hAnsi="Arial"/>
+          <w:b/>
+          <w:color w:val="41748D"/>
+          <w:sz w:val="26"/>
+        </w:rPr>
+        <w:t>7.2 Stakeholder Communication &amp; Executive Dashboards</w:t>
+      </w:r>
+    </w:p>
+    <w:p>
+      <w:pPr>
+        <w:spacing w:after="120" w:line="276" w:lineRule="auto"/>
+      </w:pPr>
+      <w:r>
+        <w:rPr>
+          <w:rFonts w:ascii="Calibri" w:hAnsi="Calibri"/>
+          <w:color w:val="333333"/>
+          <w:sz w:val="22"/>
+        </w:rPr>
+        <w:t>Communicating technical risk to business leaders requires translating flaky tests and coverage percentages into business impact, risk mitigation metrics, and ROI trends.</w:t>
       </w:r>
     </w:p>
     <w:tbl>
@@ -1301,7 +1895,7 @@
                 <w:color w:val="1B365D"/>
                 <w:sz w:val="20"/>
               </w:rPr>
-              <w:t>📌 READY FOR LEADERSHIP</w:t>
+              <w:t>📌 MASTER STUDY GUIDE CONCLUSION</w:t>
               <w:br/>
             </w:r>
             <w:r>
@@ -1311,7 +1905,7 @@
                 <w:color w:val="333333"/>
                 <w:sz w:val="21"/>
               </w:rPr>
-              <w:t>By mastering these frameworks—spanning Python, Java, TypeScript, Playwright, Locust performance testing, and advanced AI Governance—you are fully prepared for senior QA engineering management roles.</w:t>
+              <w:t>By mastering Python, Java, TypeScript, Playwright, Locust, CI/CD DevOps pipelines, Trust Architecture, and LLM-as-a-Judge governance, you possess the complete blueprint for Senior QA Engineering Management leadership.</w:t>
             </w:r>
           </w:p>
         </w:tc>

</xml_diff>